<commit_message>
Zadania_Lekcja 1_ 7 stron
</commit_message>
<xml_diff>
--- a/Zadania_Lekcja 1.docx
+++ b/Zadania_Lekcja 1.docx
@@ -2761,7 +2761,15 @@
         </w:rPr>
       </w:pPr>
       <w:r>
-        <w:rPr/>
+        <w:rPr>
+          <w:b w:val="false"/>
+          <w:bCs w:val="false"/>
+          <w:i w:val="false"/>
+          <w:caps w:val="false"/>
+          <w:smallCaps w:val="false"/>
+          <w:spacing w:val="0"/>
+          <w:u w:val="none"/>
+        </w:rPr>
       </w:r>
     </w:p>
     <w:tbl>
@@ -2778,7 +2786,7 @@
         </w:tblCellMar>
       </w:tblPr>
       <w:tblGrid>
-        <w:gridCol w:w="3175"/>
+        <w:gridCol w:w="3174"/>
         <w:gridCol w:w="6463"/>
       </w:tblGrid>
       <w:tr>
@@ -2787,13 +2795,14 @@
         </w:trPr>
         <w:tc>
           <w:tcPr>
-            <w:tcW w:w="3175" w:type="dxa"/>
+            <w:tcW w:w="3174" w:type="dxa"/>
             <w:tcBorders/>
             <w:vAlign w:val="center"/>
           </w:tcPr>
           <w:p>
             <w:pPr>
               <w:pStyle w:val="Nagwektabeli"/>
+              <w:widowControl w:val="false"/>
               <w:rPr/>
             </w:pPr>
             <w:r>
@@ -2811,6 +2820,7 @@
           <w:p>
             <w:pPr>
               <w:pStyle w:val="Nagwektabeli"/>
+              <w:widowControl w:val="false"/>
               <w:rPr/>
             </w:pPr>
             <w:r>
@@ -2824,13 +2834,14 @@
         <w:trPr/>
         <w:tc>
           <w:tcPr>
-            <w:tcW w:w="3175" w:type="dxa"/>
-            <w:tcBorders/>
-            <w:vAlign w:val="center"/>
-          </w:tcPr>
-          <w:p>
-            <w:pPr>
-              <w:pStyle w:val="Zawartotabeli"/>
+            <w:tcW w:w="3174" w:type="dxa"/>
+            <w:tcBorders/>
+            <w:vAlign w:val="center"/>
+          </w:tcPr>
+          <w:p>
+            <w:pPr>
+              <w:pStyle w:val="Zawartotabeli"/>
+              <w:widowControl w:val="false"/>
               <w:rPr/>
             </w:pPr>
             <w:r>
@@ -2850,15 +2861,12 @@
           <w:p>
             <w:pPr>
               <w:pStyle w:val="Zawartotabeli"/>
-              <w:rPr/>
-            </w:pPr>
-            <w:r>
-              <w:rPr/>
-              <w:t xml:space="preserve">Fraudów jest bardzo mało w porównaniu do legalnych transakcji </w:t>
-            </w:r>
-            <w:r>
-              <w:rPr/>
-              <w:t>(jedna klasa występuje znacznie częściej niż druga).</w:t>
+              <w:widowControl w:val="false"/>
+              <w:rPr/>
+            </w:pPr>
+            <w:r>
+              <w:rPr/>
+              <w:t>Fraudów jest bardzo mało w porównaniu do legalnych transakcji (jedna klasa występuje znacznie częściej niż druga).</w:t>
             </w:r>
           </w:p>
         </w:tc>
@@ -2867,13 +2875,14 @@
         <w:trPr/>
         <w:tc>
           <w:tcPr>
-            <w:tcW w:w="3175" w:type="dxa"/>
-            <w:tcBorders/>
-            <w:vAlign w:val="center"/>
-          </w:tcPr>
-          <w:p>
-            <w:pPr>
-              <w:pStyle w:val="Zawartotabeli"/>
+            <w:tcW w:w="3174" w:type="dxa"/>
+            <w:tcBorders/>
+            <w:vAlign w:val="center"/>
+          </w:tcPr>
+          <w:p>
+            <w:pPr>
+              <w:pStyle w:val="Zawartotabeli"/>
+              <w:widowControl w:val="false"/>
               <w:rPr/>
             </w:pPr>
             <w:r>
@@ -2893,6 +2902,7 @@
           <w:p>
             <w:pPr>
               <w:pStyle w:val="Zawartotabeli"/>
+              <w:widowControl w:val="false"/>
               <w:rPr/>
             </w:pPr>
             <w:r>
@@ -2917,13 +2927,14 @@
         <w:trPr/>
         <w:tc>
           <w:tcPr>
-            <w:tcW w:w="3175" w:type="dxa"/>
-            <w:tcBorders/>
-            <w:vAlign w:val="center"/>
-          </w:tcPr>
-          <w:p>
-            <w:pPr>
-              <w:pStyle w:val="Zawartotabeli"/>
+            <w:tcW w:w="3174" w:type="dxa"/>
+            <w:tcBorders/>
+            <w:vAlign w:val="center"/>
+          </w:tcPr>
+          <w:p>
+            <w:pPr>
+              <w:pStyle w:val="Zawartotabeli"/>
+              <w:widowControl w:val="false"/>
               <w:rPr/>
             </w:pPr>
             <w:r>
@@ -2943,15 +2954,12 @@
           <w:p>
             <w:pPr>
               <w:pStyle w:val="Zawartotabeli"/>
-              <w:rPr/>
-            </w:pPr>
-            <w:r>
-              <w:rPr/>
-              <w:t xml:space="preserve">Zbyt wiele błędnych alarmów prowadzi do blokowania legalnych transakcji klientów, </w:t>
-            </w:r>
-            <w:r>
-              <w:rPr/>
-              <w:t>działając na ryzyko reputacyjne banku.</w:t>
+              <w:widowControl w:val="false"/>
+              <w:rPr/>
+            </w:pPr>
+            <w:r>
+              <w:rPr/>
+              <w:t>Zbyt wiele błędnych alarmów prowadzi do blokowania legalnych transakcji klientów, działając na ryzyko reputacyjne banku.</w:t>
             </w:r>
           </w:p>
         </w:tc>
@@ -2960,13 +2968,14 @@
         <w:trPr/>
         <w:tc>
           <w:tcPr>
-            <w:tcW w:w="3175" w:type="dxa"/>
-            <w:tcBorders/>
-            <w:vAlign w:val="center"/>
-          </w:tcPr>
-          <w:p>
-            <w:pPr>
-              <w:pStyle w:val="Zawartotabeli"/>
+            <w:tcW w:w="3174" w:type="dxa"/>
+            <w:tcBorders/>
+            <w:vAlign w:val="center"/>
+          </w:tcPr>
+          <w:p>
+            <w:pPr>
+              <w:pStyle w:val="Zawartotabeli"/>
+              <w:widowControl w:val="false"/>
               <w:rPr/>
             </w:pPr>
             <w:r>
@@ -2986,6 +2995,7 @@
           <w:p>
             <w:pPr>
               <w:pStyle w:val="Zawartotabeli"/>
+              <w:widowControl w:val="false"/>
               <w:rPr/>
             </w:pPr>
             <w:r>
@@ -2999,13 +3009,14 @@
         <w:trPr/>
         <w:tc>
           <w:tcPr>
-            <w:tcW w:w="3175" w:type="dxa"/>
-            <w:tcBorders/>
-            <w:vAlign w:val="center"/>
-          </w:tcPr>
-          <w:p>
-            <w:pPr>
-              <w:pStyle w:val="Zawartotabeli"/>
+            <w:tcW w:w="3174" w:type="dxa"/>
+            <w:tcBorders/>
+            <w:vAlign w:val="center"/>
+          </w:tcPr>
+          <w:p>
+            <w:pPr>
+              <w:pStyle w:val="Zawartotabeli"/>
+              <w:widowControl w:val="false"/>
               <w:rPr/>
             </w:pPr>
             <w:r>
@@ -3025,6 +3036,7 @@
           <w:p>
             <w:pPr>
               <w:pStyle w:val="Zawartotabeli"/>
+              <w:widowControl w:val="false"/>
               <w:rPr/>
             </w:pPr>
             <w:r>
@@ -3038,13 +3050,14 @@
         <w:trPr/>
         <w:tc>
           <w:tcPr>
-            <w:tcW w:w="3175" w:type="dxa"/>
-            <w:tcBorders/>
-            <w:vAlign w:val="center"/>
-          </w:tcPr>
-          <w:p>
-            <w:pPr>
-              <w:pStyle w:val="Zawartotabeli"/>
+            <w:tcW w:w="3174" w:type="dxa"/>
+            <w:tcBorders/>
+            <w:vAlign w:val="center"/>
+          </w:tcPr>
+          <w:p>
+            <w:pPr>
+              <w:pStyle w:val="Zawartotabeli"/>
+              <w:widowControl w:val="false"/>
               <w:rPr/>
             </w:pPr>
             <w:r>
@@ -3064,6 +3077,7 @@
           <w:p>
             <w:pPr>
               <w:pStyle w:val="Zawartotabeli"/>
+              <w:widowControl w:val="false"/>
               <w:rPr/>
             </w:pPr>
             <w:r>
@@ -3077,13 +3091,14 @@
         <w:trPr/>
         <w:tc>
           <w:tcPr>
-            <w:tcW w:w="3175" w:type="dxa"/>
-            <w:tcBorders/>
-            <w:vAlign w:val="center"/>
-          </w:tcPr>
-          <w:p>
-            <w:pPr>
-              <w:pStyle w:val="Zawartotabeli"/>
+            <w:tcW w:w="3174" w:type="dxa"/>
+            <w:tcBorders/>
+            <w:vAlign w:val="center"/>
+          </w:tcPr>
+          <w:p>
+            <w:pPr>
+              <w:pStyle w:val="Zawartotabeli"/>
+              <w:widowControl w:val="false"/>
               <w:rPr/>
             </w:pPr>
             <w:r>
@@ -3103,6 +3118,7 @@
           <w:p>
             <w:pPr>
               <w:pStyle w:val="Zawartotabeli"/>
+              <w:widowControl w:val="false"/>
               <w:rPr/>
             </w:pPr>
             <w:r>
@@ -3132,7 +3148,15 @@
         </w:rPr>
       </w:pPr>
       <w:r>
-        <w:rPr/>
+        <w:rPr>
+          <w:b w:val="false"/>
+          <w:bCs w:val="false"/>
+          <w:i w:val="false"/>
+          <w:caps w:val="false"/>
+          <w:smallCaps w:val="false"/>
+          <w:spacing w:val="0"/>
+          <w:u w:val="none"/>
+        </w:rPr>
       </w:r>
     </w:p>
     <w:p>
@@ -3164,41 +3188,37 @@
           <w:u w:val="none"/>
         </w:rPr>
         <w:br/>
-        <w:t>Jak ocenisz model (accuracy? precision? recall? Inne?</w:t>
-      </w:r>
-      <w:r>
-        <w:rPr>
-          <w:b w:val="false"/>
-          <w:bCs w:val="false"/>
-          <w:i w:val="false"/>
-          <w:caps w:val="false"/>
-          <w:smallCaps w:val="false"/>
-          <w:spacing w:val="0"/>
-          <w:u w:val="none"/>
-        </w:rPr>
-        <w:t>)</w:t>
-      </w:r>
-    </w:p>
-    <w:p>
-      <w:pPr>
-        <w:pStyle w:val="Normal"/>
-        <w:widowControl/>
-        <w:bidi w:val="0"/>
-        <w:ind w:start="0" w:end="0" w:hanging="0"/>
-        <w:rPr>
-          <w:b w:val="false"/>
-          <w:b w:val="false"/>
-          <w:bCs w:val="false"/>
-          <w:i w:val="false"/>
-          <w:i w:val="false"/>
-          <w:caps w:val="false"/>
-          <w:smallCaps w:val="false"/>
-          <w:spacing w:val="0"/>
-          <w:u w:val="none"/>
-        </w:rPr>
-      </w:pPr>
-      <w:r>
-        <w:rPr/>
+        <w:t>Jak ocenisz model (accuracy? precision? recall? Inne?)</w:t>
+      </w:r>
+    </w:p>
+    <w:p>
+      <w:pPr>
+        <w:pStyle w:val="Normal"/>
+        <w:widowControl/>
+        <w:bidi w:val="0"/>
+        <w:ind w:start="0" w:end="0" w:hanging="0"/>
+        <w:rPr>
+          <w:b w:val="false"/>
+          <w:b w:val="false"/>
+          <w:bCs w:val="false"/>
+          <w:i w:val="false"/>
+          <w:i w:val="false"/>
+          <w:caps w:val="false"/>
+          <w:smallCaps w:val="false"/>
+          <w:spacing w:val="0"/>
+          <w:u w:val="none"/>
+        </w:rPr>
+      </w:pPr>
+      <w:r>
+        <w:rPr>
+          <w:b w:val="false"/>
+          <w:bCs w:val="false"/>
+          <w:i w:val="false"/>
+          <w:caps w:val="false"/>
+          <w:smallCaps w:val="false"/>
+          <w:spacing w:val="0"/>
+          <w:u w:val="none"/>
+        </w:rPr>
       </w:r>
     </w:p>
     <w:tbl>
@@ -3215,7 +3235,7 @@
         </w:tblCellMar>
       </w:tblPr>
       <w:tblGrid>
-        <w:gridCol w:w="2002"/>
+        <w:gridCol w:w="2001"/>
         <w:gridCol w:w="2271"/>
         <w:gridCol w:w="3405"/>
         <w:gridCol w:w="1960"/>
@@ -3226,13 +3246,14 @@
         </w:trPr>
         <w:tc>
           <w:tcPr>
-            <w:tcW w:w="2002" w:type="dxa"/>
+            <w:tcW w:w="2001" w:type="dxa"/>
             <w:tcBorders/>
             <w:vAlign w:val="center"/>
           </w:tcPr>
           <w:p>
             <w:pPr>
               <w:pStyle w:val="Nagwektabeli"/>
+              <w:widowControl w:val="false"/>
               <w:rPr/>
             </w:pPr>
             <w:r>
@@ -3250,6 +3271,7 @@
           <w:p>
             <w:pPr>
               <w:pStyle w:val="Nagwektabeli"/>
+              <w:widowControl w:val="false"/>
               <w:rPr/>
             </w:pPr>
             <w:r>
@@ -3267,6 +3289,7 @@
           <w:p>
             <w:pPr>
               <w:pStyle w:val="Nagwektabeli"/>
+              <w:widowControl w:val="false"/>
               <w:rPr>
                 <w:rFonts w:ascii="Liberation Serif" w:hAnsi="Liberation Serif" w:eastAsia="NSimSun" w:cs="Lucida Sans"/>
                 <w:b/>
@@ -3303,6 +3326,7 @@
           <w:p>
             <w:pPr>
               <w:pStyle w:val="Nagwektabeli"/>
+              <w:widowControl w:val="false"/>
               <w:rPr>
                 <w:rFonts w:ascii="Liberation Serif" w:hAnsi="Liberation Serif" w:eastAsia="NSimSun" w:cs="Lucida Sans"/>
                 <w:b/>
@@ -3335,13 +3359,14 @@
         <w:trPr/>
         <w:tc>
           <w:tcPr>
-            <w:tcW w:w="2002" w:type="dxa"/>
-            <w:tcBorders/>
-            <w:vAlign w:val="center"/>
-          </w:tcPr>
-          <w:p>
-            <w:pPr>
-              <w:pStyle w:val="Zawartotabeli"/>
+            <w:tcW w:w="2001" w:type="dxa"/>
+            <w:tcBorders/>
+            <w:vAlign w:val="center"/>
+          </w:tcPr>
+          <w:p>
+            <w:pPr>
+              <w:pStyle w:val="Zawartotabeli"/>
+              <w:widowControl w:val="false"/>
               <w:rPr/>
             </w:pPr>
             <w:r>
@@ -3361,6 +3386,7 @@
           <w:p>
             <w:pPr>
               <w:pStyle w:val="Zawartotabeli"/>
+              <w:widowControl w:val="false"/>
               <w:rPr/>
             </w:pPr>
             <w:r>
@@ -3381,6 +3407,7 @@
           <w:p>
             <w:pPr>
               <w:pStyle w:val="Zawartotabeli"/>
+              <w:widowControl w:val="false"/>
               <w:rPr/>
             </w:pPr>
             <w:r>
@@ -3398,15 +3425,12 @@
           <w:p>
             <w:pPr>
               <w:pStyle w:val="Zawartotabeli"/>
-              <w:rPr/>
-            </w:pPr>
-            <w:r>
-              <w:rPr/>
-              <w:t>Bardzo wysok</w:t>
-            </w:r>
-            <w:r>
-              <w:rPr/>
-              <w:t>a</w:t>
+              <w:widowControl w:val="false"/>
+              <w:rPr/>
+            </w:pPr>
+            <w:r>
+              <w:rPr/>
+              <w:t>Bardzo wysoka</w:t>
             </w:r>
           </w:p>
         </w:tc>
@@ -3415,13 +3439,14 @@
         <w:trPr/>
         <w:tc>
           <w:tcPr>
-            <w:tcW w:w="2002" w:type="dxa"/>
-            <w:tcBorders/>
-            <w:vAlign w:val="center"/>
-          </w:tcPr>
-          <w:p>
-            <w:pPr>
-              <w:pStyle w:val="Zawartotabeli"/>
+            <w:tcW w:w="2001" w:type="dxa"/>
+            <w:tcBorders/>
+            <w:vAlign w:val="center"/>
+          </w:tcPr>
+          <w:p>
+            <w:pPr>
+              <w:pStyle w:val="Zawartotabeli"/>
+              <w:widowControl w:val="false"/>
               <w:rPr/>
             </w:pPr>
             <w:r>
@@ -3441,6 +3466,7 @@
           <w:p>
             <w:pPr>
               <w:pStyle w:val="Zawartotabeli"/>
+              <w:widowControl w:val="false"/>
               <w:rPr/>
             </w:pPr>
             <w:r>
@@ -3461,6 +3487,7 @@
           <w:p>
             <w:pPr>
               <w:pStyle w:val="Zawartotabeli"/>
+              <w:widowControl w:val="false"/>
               <w:rPr/>
             </w:pPr>
             <w:r>
@@ -3478,15 +3505,12 @@
           <w:p>
             <w:pPr>
               <w:pStyle w:val="Zawartotabeli"/>
-              <w:rPr/>
-            </w:pPr>
-            <w:r>
-              <w:rPr/>
-              <w:t>Bardzo wysok</w:t>
-            </w:r>
-            <w:r>
-              <w:rPr/>
-              <w:t>a</w:t>
+              <w:widowControl w:val="false"/>
+              <w:rPr/>
+            </w:pPr>
+            <w:r>
+              <w:rPr/>
+              <w:t>Bardzo wysoka</w:t>
             </w:r>
           </w:p>
         </w:tc>
@@ -3495,13 +3519,14 @@
         <w:trPr/>
         <w:tc>
           <w:tcPr>
-            <w:tcW w:w="2002" w:type="dxa"/>
-            <w:tcBorders/>
-            <w:vAlign w:val="center"/>
-          </w:tcPr>
-          <w:p>
-            <w:pPr>
-              <w:pStyle w:val="Zawartotabeli"/>
+            <w:tcW w:w="2001" w:type="dxa"/>
+            <w:tcBorders/>
+            <w:vAlign w:val="center"/>
+          </w:tcPr>
+          <w:p>
+            <w:pPr>
+              <w:pStyle w:val="Zawartotabeli"/>
+              <w:widowControl w:val="false"/>
               <w:rPr/>
             </w:pPr>
             <w:r>
@@ -3521,6 +3546,7 @@
           <w:p>
             <w:pPr>
               <w:pStyle w:val="Zawartotabeli"/>
+              <w:widowControl w:val="false"/>
               <w:rPr/>
             </w:pPr>
             <w:r>
@@ -3541,6 +3567,7 @@
           <w:p>
             <w:pPr>
               <w:pStyle w:val="Zawartotabeli"/>
+              <w:widowControl w:val="false"/>
               <w:rPr/>
             </w:pPr>
             <w:r>
@@ -3558,15 +3585,12 @@
           <w:p>
             <w:pPr>
               <w:pStyle w:val="Zawartotabeli"/>
-              <w:rPr/>
-            </w:pPr>
-            <w:r>
-              <w:rPr/>
-              <w:t>Bardzo wysok</w:t>
-            </w:r>
-            <w:r>
-              <w:rPr/>
-              <w:t>a</w:t>
+              <w:widowControl w:val="false"/>
+              <w:rPr/>
+            </w:pPr>
+            <w:r>
+              <w:rPr/>
+              <w:t>Bardzo wysoka</w:t>
             </w:r>
           </w:p>
         </w:tc>
@@ -3575,13 +3599,14 @@
         <w:trPr/>
         <w:tc>
           <w:tcPr>
-            <w:tcW w:w="2002" w:type="dxa"/>
-            <w:tcBorders/>
-            <w:vAlign w:val="center"/>
-          </w:tcPr>
-          <w:p>
-            <w:pPr>
-              <w:pStyle w:val="Zawartotabeli"/>
+            <w:tcW w:w="2001" w:type="dxa"/>
+            <w:tcBorders/>
+            <w:vAlign w:val="center"/>
+          </w:tcPr>
+          <w:p>
+            <w:pPr>
+              <w:pStyle w:val="Zawartotabeli"/>
+              <w:widowControl w:val="false"/>
               <w:rPr/>
             </w:pPr>
             <w:r>
@@ -3601,6 +3626,7 @@
           <w:p>
             <w:pPr>
               <w:pStyle w:val="Zawartotabeli"/>
+              <w:widowControl w:val="false"/>
               <w:rPr/>
             </w:pPr>
             <w:r>
@@ -3618,6 +3644,7 @@
           <w:p>
             <w:pPr>
               <w:pStyle w:val="Zawartotabeli"/>
+              <w:widowControl w:val="false"/>
               <w:rPr/>
             </w:pPr>
             <w:r>
@@ -3635,15 +3662,12 @@
           <w:p>
             <w:pPr>
               <w:pStyle w:val="Zawartotabeli"/>
-              <w:rPr/>
-            </w:pPr>
-            <w:r>
-              <w:rPr/>
-              <w:t>Bardzo wysok</w:t>
-            </w:r>
-            <w:r>
-              <w:rPr/>
-              <w:t>a</w:t>
+              <w:widowControl w:val="false"/>
+              <w:rPr/>
+            </w:pPr>
+            <w:r>
+              <w:rPr/>
+              <w:t>Bardzo wysoka</w:t>
             </w:r>
           </w:p>
         </w:tc>
@@ -3652,13 +3676,14 @@
         <w:trPr/>
         <w:tc>
           <w:tcPr>
-            <w:tcW w:w="2002" w:type="dxa"/>
-            <w:tcBorders/>
-            <w:vAlign w:val="center"/>
-          </w:tcPr>
-          <w:p>
-            <w:pPr>
-              <w:pStyle w:val="Zawartotabeli"/>
+            <w:tcW w:w="2001" w:type="dxa"/>
+            <w:tcBorders/>
+            <w:vAlign w:val="center"/>
+          </w:tcPr>
+          <w:p>
+            <w:pPr>
+              <w:pStyle w:val="Zawartotabeli"/>
+              <w:widowControl w:val="false"/>
               <w:rPr/>
             </w:pPr>
             <w:r>
@@ -3678,6 +3703,7 @@
           <w:p>
             <w:pPr>
               <w:pStyle w:val="Zawartotabeli"/>
+              <w:widowControl w:val="false"/>
               <w:rPr/>
             </w:pPr>
             <w:r>
@@ -3695,6 +3721,7 @@
           <w:p>
             <w:pPr>
               <w:pStyle w:val="Zawartotabeli"/>
+              <w:widowControl w:val="false"/>
               <w:rPr/>
             </w:pPr>
             <w:r>
@@ -3712,15 +3739,12 @@
           <w:p>
             <w:pPr>
               <w:pStyle w:val="Zawartotabeli"/>
-              <w:rPr/>
-            </w:pPr>
-            <w:r>
-              <w:rPr/>
-              <w:t>Wysok</w:t>
-            </w:r>
-            <w:r>
-              <w:rPr/>
-              <w:t>a</w:t>
+              <w:widowControl w:val="false"/>
+              <w:rPr/>
+            </w:pPr>
+            <w:r>
+              <w:rPr/>
+              <w:t>Wysoka</w:t>
             </w:r>
           </w:p>
         </w:tc>
@@ -3729,13 +3753,14 @@
         <w:trPr/>
         <w:tc>
           <w:tcPr>
-            <w:tcW w:w="2002" w:type="dxa"/>
-            <w:tcBorders/>
-            <w:vAlign w:val="center"/>
-          </w:tcPr>
-          <w:p>
-            <w:pPr>
-              <w:pStyle w:val="Zawartotabeli"/>
+            <w:tcW w:w="2001" w:type="dxa"/>
+            <w:tcBorders/>
+            <w:vAlign w:val="center"/>
+          </w:tcPr>
+          <w:p>
+            <w:pPr>
+              <w:pStyle w:val="Zawartotabeli"/>
+              <w:widowControl w:val="false"/>
               <w:rPr/>
             </w:pPr>
             <w:r>
@@ -3755,6 +3780,7 @@
           <w:p>
             <w:pPr>
               <w:pStyle w:val="Zawartotabeli"/>
+              <w:widowControl w:val="false"/>
               <w:rPr/>
             </w:pPr>
             <w:r>
@@ -3775,6 +3801,7 @@
           <w:p>
             <w:pPr>
               <w:pStyle w:val="Zawartotabeli"/>
+              <w:widowControl w:val="false"/>
               <w:rPr/>
             </w:pPr>
             <w:r>
@@ -3792,15 +3819,12 @@
           <w:p>
             <w:pPr>
               <w:pStyle w:val="Zawartotabeli"/>
-              <w:rPr/>
-            </w:pPr>
-            <w:r>
-              <w:rPr/>
-              <w:t>Wysok</w:t>
-            </w:r>
-            <w:r>
-              <w:rPr/>
-              <w:t>a</w:t>
+              <w:widowControl w:val="false"/>
+              <w:rPr/>
+            </w:pPr>
+            <w:r>
+              <w:rPr/>
+              <w:t>Wysoka</w:t>
             </w:r>
           </w:p>
         </w:tc>
@@ -3809,13 +3833,14 @@
         <w:trPr/>
         <w:tc>
           <w:tcPr>
-            <w:tcW w:w="2002" w:type="dxa"/>
-            <w:tcBorders/>
-            <w:vAlign w:val="center"/>
-          </w:tcPr>
-          <w:p>
-            <w:pPr>
-              <w:pStyle w:val="Zawartotabeli"/>
+            <w:tcW w:w="2001" w:type="dxa"/>
+            <w:tcBorders/>
+            <w:vAlign w:val="center"/>
+          </w:tcPr>
+          <w:p>
+            <w:pPr>
+              <w:pStyle w:val="Zawartotabeli"/>
+              <w:widowControl w:val="false"/>
               <w:rPr/>
             </w:pPr>
             <w:r>
@@ -3835,6 +3860,7 @@
           <w:p>
             <w:pPr>
               <w:pStyle w:val="Zawartotabeli"/>
+              <w:widowControl w:val="false"/>
               <w:rPr/>
             </w:pPr>
             <w:r>
@@ -3855,6 +3881,7 @@
           <w:p>
             <w:pPr>
               <w:pStyle w:val="Zawartotabeli"/>
+              <w:widowControl w:val="false"/>
               <w:rPr/>
             </w:pPr>
             <w:r>
@@ -3872,15 +3899,12 @@
           <w:p>
             <w:pPr>
               <w:pStyle w:val="Zawartotabeli"/>
-              <w:rPr/>
-            </w:pPr>
-            <w:r>
-              <w:rPr/>
-              <w:t>Wysok</w:t>
-            </w:r>
-            <w:r>
-              <w:rPr/>
-              <w:t>a</w:t>
+              <w:widowControl w:val="false"/>
+              <w:rPr/>
+            </w:pPr>
+            <w:r>
+              <w:rPr/>
+              <w:t>Wysoka</w:t>
             </w:r>
           </w:p>
         </w:tc>
@@ -3889,13 +3913,14 @@
         <w:trPr/>
         <w:tc>
           <w:tcPr>
-            <w:tcW w:w="2002" w:type="dxa"/>
-            <w:tcBorders/>
-            <w:vAlign w:val="center"/>
-          </w:tcPr>
-          <w:p>
-            <w:pPr>
-              <w:pStyle w:val="Zawartotabeli"/>
+            <w:tcW w:w="2001" w:type="dxa"/>
+            <w:tcBorders/>
+            <w:vAlign w:val="center"/>
+          </w:tcPr>
+          <w:p>
+            <w:pPr>
+              <w:pStyle w:val="Zawartotabeli"/>
+              <w:widowControl w:val="false"/>
               <w:rPr/>
             </w:pPr>
             <w:r>
@@ -3915,6 +3940,7 @@
           <w:p>
             <w:pPr>
               <w:pStyle w:val="Zawartotabeli"/>
+              <w:widowControl w:val="false"/>
               <w:rPr/>
             </w:pPr>
             <w:r>
@@ -3935,6 +3961,7 @@
           <w:p>
             <w:pPr>
               <w:pStyle w:val="Zawartotabeli"/>
+              <w:widowControl w:val="false"/>
               <w:rPr/>
             </w:pPr>
             <w:r>
@@ -3952,15 +3979,12 @@
           <w:p>
             <w:pPr>
               <w:pStyle w:val="Zawartotabeli"/>
-              <w:rPr/>
-            </w:pPr>
-            <w:r>
-              <w:rPr/>
-              <w:t>Nisk</w:t>
-            </w:r>
-            <w:r>
-              <w:rPr/>
-              <w:t>a</w:t>
+              <w:widowControl w:val="false"/>
+              <w:rPr/>
+            </w:pPr>
+            <w:r>
+              <w:rPr/>
+              <w:t>Niska</w:t>
             </w:r>
           </w:p>
         </w:tc>
@@ -3985,7 +4009,15 @@
         </w:rPr>
       </w:pPr>
       <w:r>
-        <w:rPr/>
+        <w:rPr>
+          <w:b w:val="false"/>
+          <w:bCs w:val="false"/>
+          <w:i w:val="false"/>
+          <w:caps w:val="false"/>
+          <w:smallCaps w:val="false"/>
+          <w:spacing w:val="0"/>
+          <w:u w:val="none"/>
+        </w:rPr>
       </w:r>
     </w:p>
     <w:p>
@@ -4017,31 +4049,7 @@
           <w:u w:val="none"/>
         </w:rPr>
         <w:br/>
-        <w:t xml:space="preserve">Jak zapewnisz, że system jest energooszczędny 10M transakcji/dzień!? - </w:t>
-      </w:r>
-      <w:r>
-        <w:rPr>
-          <w:b w:val="false"/>
-          <w:bCs w:val="false"/>
-          <w:i w:val="false"/>
-          <w:caps w:val="false"/>
-          <w:smallCaps w:val="false"/>
-          <w:spacing w:val="0"/>
-          <w:u w:val="none"/>
-        </w:rPr>
-        <w:t xml:space="preserve">Warto wdrożyć monitoring efficiency ratio (accuracy/energochłonność), </w:t>
-      </w:r>
-      <w:r>
-        <w:rPr>
-          <w:b w:val="false"/>
-          <w:bCs w:val="false"/>
-          <w:i w:val="false"/>
-          <w:caps w:val="false"/>
-          <w:smallCaps w:val="false"/>
-          <w:spacing w:val="0"/>
-          <w:u w:val="none"/>
-        </w:rPr>
-        <w:t>można rozważyć kompresję danych dla dużych modeli, wprowadzić batch processing zamiast real-time (np. weryfikacja transakcji 2 razy dziennie), usunięcie zbędnych zmiennych (feature selection), albo zastosowa</w:t>
+        <w:t>Jak zapewnisz, że system jest energooszczędny 10M transakcji/dzień!? - Warto wdrożyć monitoring efficiency ratio (accuracy/energochłonność), można rozważyć kompresję danych dla dużych modeli, wprowadzić batch processing zamiast real-time (np. weryfikacja transakcji 2 razy dziennie), usunięcie zbędnych zmiennych (feature selection), albo zastosowa</w:t>
       </w:r>
       <w:r>
         <w:rPr>
@@ -4123,7 +4131,15 @@
         </w:rPr>
       </w:pPr>
       <w:r>
-        <w:rPr/>
+        <w:rPr>
+          <w:b w:val="false"/>
+          <w:bCs w:val="false"/>
+          <w:i w:val="false"/>
+          <w:caps w:val="false"/>
+          <w:smallCaps w:val="false"/>
+          <w:spacing w:val="0"/>
+          <w:u w:val="none"/>
+        </w:rPr>
       </w:r>
       <w:r>
         <w:br w:type="page"/>
@@ -4200,107 +4216,1564 @@
       </w:pPr>
       <w:r>
         <w:rPr/>
-        <w:t>Zaprojektuj rozwiązanie oparte na regułach</w:t>
-      </w:r>
-    </w:p>
-    <w:p>
-      <w:pPr>
-        <w:pStyle w:val="Normal"/>
-        <w:widowControl/>
-        <w:bidi w:val="0"/>
-        <w:ind w:start="0" w:end="0" w:hanging="0"/>
-        <w:rPr/>
-      </w:pPr>
-      <w:r>
-        <w:rPr/>
-      </w:r>
-    </w:p>
-    <w:p>
-      <w:pPr>
-        <w:pStyle w:val="Normal"/>
-        <w:widowControl/>
-        <w:bidi w:val="0"/>
-        <w:ind w:start="0" w:end="0" w:hanging="0"/>
-        <w:rPr/>
-      </w:pPr>
-      <w:r>
-        <w:rPr/>
-        <w:t>Zaprojektuj rozwiązanie oparte na ML</w:t>
-      </w:r>
-    </w:p>
-    <w:p>
-      <w:pPr>
-        <w:pStyle w:val="Normal"/>
-        <w:widowControl/>
-        <w:bidi w:val="0"/>
-        <w:ind w:start="0" w:end="0" w:hanging="0"/>
-        <w:rPr/>
-      </w:pPr>
-      <w:r>
-        <w:rPr/>
-      </w:r>
-    </w:p>
-    <w:p>
-      <w:pPr>
-        <w:pStyle w:val="Normal"/>
-        <w:widowControl/>
-        <w:bidi w:val="0"/>
-        <w:ind w:start="0" w:end="0" w:hanging="0"/>
-        <w:rPr/>
-      </w:pPr>
-      <w:r>
-        <w:rPr/>
-        <w:t>Porównaj: dokładność, łatwość utrzymania, zużycie energii, koszt</w:t>
-      </w:r>
-    </w:p>
-    <w:p>
-      <w:pPr>
-        <w:pStyle w:val="Normal"/>
-        <w:widowControl/>
-        <w:bidi w:val="0"/>
-        <w:ind w:start="0" w:end="0" w:hanging="0"/>
-        <w:rPr/>
-      </w:pPr>
-      <w:r>
-        <w:rPr/>
-      </w:r>
-    </w:p>
-    <w:p>
-      <w:pPr>
-        <w:pStyle w:val="Normal"/>
-        <w:widowControl/>
-        <w:bidi w:val="0"/>
-        <w:ind w:start="0" w:end="0" w:hanging="0"/>
-        <w:rPr/>
-      </w:pPr>
-      <w:r>
-        <w:rPr/>
-        <w:t>Która metoda jest lepsza i dlaczego?</w:t>
-      </w:r>
-    </w:p>
-    <w:p>
-      <w:pPr>
-        <w:pStyle w:val="Normal"/>
-        <w:widowControl/>
-        <w:bidi w:val="0"/>
-        <w:ind w:start="0" w:end="0" w:hanging="0"/>
-        <w:rPr/>
-      </w:pPr>
-      <w:r>
-        <w:rPr/>
-      </w:r>
-    </w:p>
-    <w:p>
-      <w:pPr>
-        <w:pStyle w:val="Normal"/>
-        <w:widowControl/>
-        <w:bidi w:val="0"/>
-        <w:ind w:start="0" w:end="0" w:hanging="0"/>
-        <w:rPr/>
-      </w:pPr>
-      <w:r>
-        <w:rPr/>
-        <w:t>Czy można połączyć oba podejścia? Jak?</w:t>
+        <w:t xml:space="preserve">Porównaj: dokładność, łatwość utrzymania, zużycie energii, koszt </w:t>
+      </w:r>
+      <w:r>
+        <w:rPr/>
+        <w:t>(w tabeli poniżej)</w:t>
+      </w:r>
+    </w:p>
+    <w:p>
+      <w:pPr>
+        <w:pStyle w:val="Normal"/>
+        <w:widowControl/>
+        <w:bidi w:val="0"/>
+        <w:ind w:start="0" w:end="0" w:hanging="0"/>
+        <w:rPr/>
+      </w:pPr>
+      <w:r>
+        <w:rPr/>
+      </w:r>
+    </w:p>
+    <w:tbl>
+      <w:tblPr>
+        <w:tblW w:w="9638" w:type="dxa"/>
+        <w:jc w:val="start"/>
+        <w:tblInd w:w="0" w:type="dxa"/>
+        <w:tblLayout w:type="fixed"/>
+        <w:tblCellMar>
+          <w:top w:w="28" w:type="dxa"/>
+          <w:start w:w="28" w:type="dxa"/>
+          <w:bottom w:w="28" w:type="dxa"/>
+          <w:end w:w="28" w:type="dxa"/>
+        </w:tblCellMar>
+      </w:tblPr>
+      <w:tblGrid>
+        <w:gridCol w:w="1914"/>
+        <w:gridCol w:w="3811"/>
+        <w:gridCol w:w="3913"/>
+      </w:tblGrid>
+      <w:tr>
+        <w:trPr>
+          <w:tblHeader w:val="true"/>
+        </w:trPr>
+        <w:tc>
+          <w:tcPr>
+            <w:tcW w:w="1914" w:type="dxa"/>
+            <w:tcBorders/>
+            <w:vAlign w:val="center"/>
+          </w:tcPr>
+          <w:p>
+            <w:pPr>
+              <w:pStyle w:val="Nagwektabeli"/>
+              <w:rPr/>
+            </w:pPr>
+            <w:r>
+              <w:rPr/>
+              <w:t>Kryterium</w:t>
+            </w:r>
+          </w:p>
+        </w:tc>
+        <w:tc>
+          <w:tcPr>
+            <w:tcW w:w="3811" w:type="dxa"/>
+            <w:tcBorders/>
+            <w:vAlign w:val="center"/>
+          </w:tcPr>
+          <w:p>
+            <w:pPr>
+              <w:pStyle w:val="Nagwektabeli"/>
+              <w:rPr/>
+            </w:pPr>
+            <w:r>
+              <w:rPr/>
+              <w:t>Tradycyjne programowanie (reguły)</w:t>
+            </w:r>
+          </w:p>
+        </w:tc>
+        <w:tc>
+          <w:tcPr>
+            <w:tcW w:w="3913" w:type="dxa"/>
+            <w:tcBorders/>
+            <w:vAlign w:val="center"/>
+          </w:tcPr>
+          <w:p>
+            <w:pPr>
+              <w:pStyle w:val="Nagwektabeli"/>
+              <w:rPr/>
+            </w:pPr>
+            <w:r>
+              <w:rPr/>
+              <w:t>Machine Learning</w:t>
+            </w:r>
+          </w:p>
+        </w:tc>
+      </w:tr>
+      <w:tr>
+        <w:trPr/>
+        <w:tc>
+          <w:tcPr>
+            <w:tcW w:w="1914" w:type="dxa"/>
+            <w:tcBorders/>
+            <w:vAlign w:val="center"/>
+          </w:tcPr>
+          <w:p>
+            <w:pPr>
+              <w:pStyle w:val="Zawartotabeli"/>
+              <w:rPr/>
+            </w:pPr>
+            <w:r>
+              <w:rPr>
+                <w:rStyle w:val="Mocnewyrnione"/>
+              </w:rPr>
+              <w:t>Sposób działania</w:t>
+            </w:r>
+          </w:p>
+        </w:tc>
+        <w:tc>
+          <w:tcPr>
+            <w:tcW w:w="3811" w:type="dxa"/>
+            <w:tcBorders/>
+            <w:vAlign w:val="center"/>
+          </w:tcPr>
+          <w:p>
+            <w:pPr>
+              <w:pStyle w:val="Zawartotabeli"/>
+              <w:rPr/>
+            </w:pPr>
+            <w:r>
+              <w:rPr/>
+              <w:t>Programista tworzy zestaw reguł i listę zakazanych słów, według których oceniane są komentarze.</w:t>
+            </w:r>
+          </w:p>
+        </w:tc>
+        <w:tc>
+          <w:tcPr>
+            <w:tcW w:w="3913" w:type="dxa"/>
+            <w:tcBorders/>
+            <w:vAlign w:val="center"/>
+          </w:tcPr>
+          <w:p>
+            <w:pPr>
+              <w:pStyle w:val="Zawartotabeli"/>
+              <w:rPr/>
+            </w:pPr>
+            <w:r>
+              <w:rPr/>
+              <w:t>Model uczy się na przykładach komentarzy oznaczonych jako obraźliwe i nieobraźliwe, a następnie sam klasyfikuje nowe komentarze.</w:t>
+            </w:r>
+          </w:p>
+        </w:tc>
+      </w:tr>
+      <w:tr>
+        <w:trPr/>
+        <w:tc>
+          <w:tcPr>
+            <w:tcW w:w="1914" w:type="dxa"/>
+            <w:tcBorders/>
+            <w:vAlign w:val="center"/>
+          </w:tcPr>
+          <w:p>
+            <w:pPr>
+              <w:pStyle w:val="Zawartotabeli"/>
+              <w:rPr/>
+            </w:pPr>
+            <w:r>
+              <w:rPr>
+                <w:rStyle w:val="Mocnewyrnione"/>
+              </w:rPr>
+              <w:t>Przykład reguły</w:t>
+            </w:r>
+          </w:p>
+        </w:tc>
+        <w:tc>
+          <w:tcPr>
+            <w:tcW w:w="3811" w:type="dxa"/>
+            <w:tcBorders/>
+            <w:vAlign w:val="center"/>
+          </w:tcPr>
+          <w:p>
+            <w:pPr>
+              <w:pStyle w:val="Zawartotabeli"/>
+              <w:rPr/>
+            </w:pPr>
+            <w:r>
+              <w:rPr/>
+              <w:t xml:space="preserve">Jeśli komentarz zawiera słowo z czarnej listy, </w:t>
+            </w:r>
+            <w:r>
+              <w:rPr/>
+              <w:t>oznacza komentarz jako obraźliwy.</w:t>
+            </w:r>
+          </w:p>
+        </w:tc>
+        <w:tc>
+          <w:tcPr>
+            <w:tcW w:w="3913" w:type="dxa"/>
+            <w:tcBorders/>
+            <w:vAlign w:val="center"/>
+          </w:tcPr>
+          <w:p>
+            <w:pPr>
+              <w:pStyle w:val="Zawartotabeli"/>
+              <w:rPr/>
+            </w:pPr>
+            <w:r>
+              <w:rPr/>
+              <w:t>Brak ręcznie definiowanych reguł. Model sam uczy się wzorców na podstawie danych treningowych.</w:t>
+            </w:r>
+          </w:p>
+        </w:tc>
+      </w:tr>
+      <w:tr>
+        <w:trPr/>
+        <w:tc>
+          <w:tcPr>
+            <w:tcW w:w="1914" w:type="dxa"/>
+            <w:tcBorders/>
+            <w:vAlign w:val="center"/>
+          </w:tcPr>
+          <w:p>
+            <w:pPr>
+              <w:pStyle w:val="Zawartotabeli"/>
+              <w:rPr/>
+            </w:pPr>
+            <w:r>
+              <w:rPr>
+                <w:rStyle w:val="Mocnewyrnione"/>
+              </w:rPr>
+              <w:t>Sposób implementacji</w:t>
+            </w:r>
+          </w:p>
+        </w:tc>
+        <w:tc>
+          <w:tcPr>
+            <w:tcW w:w="3811" w:type="dxa"/>
+            <w:tcBorders/>
+            <w:vAlign w:val="center"/>
+          </w:tcPr>
+          <w:p>
+            <w:pPr>
+              <w:pStyle w:val="Zawartotabeli"/>
+              <w:rPr/>
+            </w:pPr>
+            <w:r>
+              <w:rPr/>
+              <w:t>Tworzenie i testowanie warunków, słowników oraz wyrażeń regularnych.</w:t>
+            </w:r>
+          </w:p>
+        </w:tc>
+        <w:tc>
+          <w:tcPr>
+            <w:tcW w:w="3913" w:type="dxa"/>
+            <w:tcBorders/>
+            <w:vAlign w:val="center"/>
+          </w:tcPr>
+          <w:p>
+            <w:pPr>
+              <w:pStyle w:val="Zawartotabeli"/>
+              <w:rPr/>
+            </w:pPr>
+            <w:r>
+              <w:rPr/>
+              <w:t>Zebranie danych, przygotowanie zbioru treningowego, wytrenowanie i wdrożenie modelu.</w:t>
+            </w:r>
+          </w:p>
+        </w:tc>
+      </w:tr>
+      <w:tr>
+        <w:trPr/>
+        <w:tc>
+          <w:tcPr>
+            <w:tcW w:w="1914" w:type="dxa"/>
+            <w:tcBorders/>
+            <w:vAlign w:val="center"/>
+          </w:tcPr>
+          <w:p>
+            <w:pPr>
+              <w:pStyle w:val="Zawartotabeli"/>
+              <w:rPr/>
+            </w:pPr>
+            <w:r>
+              <w:rPr>
+                <w:rStyle w:val="Mocnewyrnione"/>
+              </w:rPr>
+              <w:t>Wykrywanie nowych obelg</w:t>
+            </w:r>
+          </w:p>
+        </w:tc>
+        <w:tc>
+          <w:tcPr>
+            <w:tcW w:w="3811" w:type="dxa"/>
+            <w:tcBorders/>
+            <w:vAlign w:val="center"/>
+          </w:tcPr>
+          <w:p>
+            <w:pPr>
+              <w:pStyle w:val="Zawartotabeli"/>
+              <w:rPr/>
+            </w:pPr>
+            <w:r>
+              <w:rPr/>
+              <w:t xml:space="preserve">Słabe - </w:t>
+            </w:r>
+            <w:r>
+              <w:rPr/>
+              <w:t>k</w:t>
+            </w:r>
+            <w:r>
+              <w:rPr/>
+              <w:t>ażdą nową obelgę trzeba ręcznie dodać do systemu.</w:t>
+            </w:r>
+          </w:p>
+        </w:tc>
+        <w:tc>
+          <w:tcPr>
+            <w:tcW w:w="3913" w:type="dxa"/>
+            <w:tcBorders/>
+            <w:vAlign w:val="center"/>
+          </w:tcPr>
+          <w:p>
+            <w:pPr>
+              <w:pStyle w:val="Zawartotabeli"/>
+              <w:rPr/>
+            </w:pPr>
+            <w:r>
+              <w:rPr/>
+              <w:t xml:space="preserve">Dobre - </w:t>
+            </w:r>
+            <w:r>
+              <w:rPr/>
+              <w:t>m</w:t>
+            </w:r>
+            <w:r>
+              <w:rPr/>
+              <w:t>odel może rozpoznawać nowe lub podobne wzorce językowe.</w:t>
+            </w:r>
+          </w:p>
+        </w:tc>
+      </w:tr>
+      <w:tr>
+        <w:trPr/>
+        <w:tc>
+          <w:tcPr>
+            <w:tcW w:w="1914" w:type="dxa"/>
+            <w:tcBorders/>
+            <w:vAlign w:val="center"/>
+          </w:tcPr>
+          <w:p>
+            <w:pPr>
+              <w:pStyle w:val="Zawartotabeli"/>
+              <w:rPr/>
+            </w:pPr>
+            <w:r>
+              <w:rPr>
+                <w:rStyle w:val="Mocnewyrnione"/>
+              </w:rPr>
+              <w:t>Uwzględnianie kontekstu</w:t>
+            </w:r>
+          </w:p>
+        </w:tc>
+        <w:tc>
+          <w:tcPr>
+            <w:tcW w:w="3811" w:type="dxa"/>
+            <w:tcBorders/>
+            <w:vAlign w:val="center"/>
+          </w:tcPr>
+          <w:p>
+            <w:pPr>
+              <w:pStyle w:val="Zawartotabeli"/>
+              <w:rPr/>
+            </w:pPr>
+            <w:r>
+              <w:rPr/>
+              <w:t>Bardzo ograniczone. Analiza opiera się głównie na konkretnych słowach.</w:t>
+            </w:r>
+          </w:p>
+        </w:tc>
+        <w:tc>
+          <w:tcPr>
+            <w:tcW w:w="3913" w:type="dxa"/>
+            <w:tcBorders/>
+            <w:vAlign w:val="center"/>
+          </w:tcPr>
+          <w:p>
+            <w:pPr>
+              <w:pStyle w:val="Zawartotabeli"/>
+              <w:rPr/>
+            </w:pPr>
+            <w:r>
+              <w:rPr/>
+              <w:t>Dobre. Model może brać pod uwagę znaczenie całego zdania.</w:t>
+            </w:r>
+          </w:p>
+        </w:tc>
+      </w:tr>
+      <w:tr>
+        <w:trPr/>
+        <w:tc>
+          <w:tcPr>
+            <w:tcW w:w="1914" w:type="dxa"/>
+            <w:tcBorders/>
+            <w:vAlign w:val="center"/>
+          </w:tcPr>
+          <w:p>
+            <w:pPr>
+              <w:pStyle w:val="Zawartotabeli"/>
+              <w:rPr/>
+            </w:pPr>
+            <w:r>
+              <w:rPr>
+                <w:rStyle w:val="Mocnewyrnione"/>
+              </w:rPr>
+              <w:t>Obsługa błędów pisowni</w:t>
+            </w:r>
+          </w:p>
+        </w:tc>
+        <w:tc>
+          <w:tcPr>
+            <w:tcW w:w="3811" w:type="dxa"/>
+            <w:tcBorders/>
+            <w:vAlign w:val="center"/>
+          </w:tcPr>
+          <w:p>
+            <w:pPr>
+              <w:pStyle w:val="Zawartotabeli"/>
+              <w:rPr/>
+            </w:pPr>
+            <w:r>
+              <w:rPr/>
+              <w:t>Wymaga dodatkowych reguł dla każdej odmiany lub literówki.</w:t>
+            </w:r>
+          </w:p>
+        </w:tc>
+        <w:tc>
+          <w:tcPr>
+            <w:tcW w:w="3913" w:type="dxa"/>
+            <w:tcBorders/>
+            <w:vAlign w:val="center"/>
+          </w:tcPr>
+          <w:p>
+            <w:pPr>
+              <w:pStyle w:val="Zawartotabeli"/>
+              <w:rPr/>
+            </w:pPr>
+            <w:r>
+              <w:rPr/>
+              <w:t>Zwykle lepsza. Model może nauczyć się rozpoznawać zniekształcone formy słów.</w:t>
+            </w:r>
+          </w:p>
+        </w:tc>
+      </w:tr>
+      <w:tr>
+        <w:trPr/>
+        <w:tc>
+          <w:tcPr>
+            <w:tcW w:w="1914" w:type="dxa"/>
+            <w:tcBorders/>
+            <w:vAlign w:val="center"/>
+          </w:tcPr>
+          <w:p>
+            <w:pPr>
+              <w:pStyle w:val="Zawartotabeli"/>
+              <w:rPr/>
+            </w:pPr>
+            <w:r>
+              <w:rPr>
+                <w:rStyle w:val="Mocnewyrnione"/>
+              </w:rPr>
+              <w:t>Skuteczność przy dużej skali</w:t>
+            </w:r>
+          </w:p>
+        </w:tc>
+        <w:tc>
+          <w:tcPr>
+            <w:tcW w:w="3811" w:type="dxa"/>
+            <w:tcBorders/>
+            <w:vAlign w:val="center"/>
+          </w:tcPr>
+          <w:p>
+            <w:pPr>
+              <w:pStyle w:val="Zawartotabeli"/>
+              <w:rPr/>
+            </w:pPr>
+            <w:r>
+              <w:rPr/>
+              <w:t>Maleje wraz ze wzrostem liczby reguł i wyjątków.</w:t>
+            </w:r>
+          </w:p>
+        </w:tc>
+        <w:tc>
+          <w:tcPr>
+            <w:tcW w:w="3913" w:type="dxa"/>
+            <w:tcBorders/>
+            <w:vAlign w:val="center"/>
+          </w:tcPr>
+          <w:p>
+            <w:pPr>
+              <w:pStyle w:val="Zawartotabeli"/>
+              <w:rPr/>
+            </w:pPr>
+            <w:r>
+              <w:rPr/>
+              <w:t>Wysoka, szczególnie dla dużych zbiorów komentarzy.</w:t>
+            </w:r>
+          </w:p>
+        </w:tc>
+      </w:tr>
+      <w:tr>
+        <w:trPr/>
+        <w:tc>
+          <w:tcPr>
+            <w:tcW w:w="1914" w:type="dxa"/>
+            <w:tcBorders/>
+            <w:vAlign w:val="center"/>
+          </w:tcPr>
+          <w:p>
+            <w:pPr>
+              <w:pStyle w:val="Zawartotabeli"/>
+              <w:rPr/>
+            </w:pPr>
+            <w:r>
+              <w:rPr>
+                <w:rStyle w:val="Mocnewyrnione"/>
+              </w:rPr>
+              <w:t>Przejrzystość decyzji</w:t>
+            </w:r>
+          </w:p>
+        </w:tc>
+        <w:tc>
+          <w:tcPr>
+            <w:tcW w:w="3811" w:type="dxa"/>
+            <w:tcBorders/>
+            <w:vAlign w:val="center"/>
+          </w:tcPr>
+          <w:p>
+            <w:pPr>
+              <w:pStyle w:val="Zawartotabeli"/>
+              <w:rPr/>
+            </w:pPr>
+            <w:r>
+              <w:rPr/>
+              <w:t>Bardzo wysoka. Można łatwo wskazać, która reguła została spełniona.</w:t>
+            </w:r>
+          </w:p>
+        </w:tc>
+        <w:tc>
+          <w:tcPr>
+            <w:tcW w:w="3913" w:type="dxa"/>
+            <w:tcBorders/>
+            <w:vAlign w:val="center"/>
+          </w:tcPr>
+          <w:p>
+            <w:pPr>
+              <w:pStyle w:val="Zawartotabeli"/>
+              <w:rPr/>
+            </w:pPr>
+            <w:r>
+              <w:rPr/>
+              <w:t>Niższa. Trudniej wyjaśnić, dlaczego model podjął konkretną decyzję.</w:t>
+            </w:r>
+          </w:p>
+        </w:tc>
+      </w:tr>
+      <w:tr>
+        <w:trPr/>
+        <w:tc>
+          <w:tcPr>
+            <w:tcW w:w="1914" w:type="dxa"/>
+            <w:tcBorders/>
+            <w:vAlign w:val="center"/>
+          </w:tcPr>
+          <w:p>
+            <w:pPr>
+              <w:pStyle w:val="Zawartotabeli"/>
+              <w:rPr/>
+            </w:pPr>
+            <w:r>
+              <w:rPr>
+                <w:rStyle w:val="Mocnewyrnione"/>
+              </w:rPr>
+              <w:t>Koszt początkowy</w:t>
+            </w:r>
+          </w:p>
+        </w:tc>
+        <w:tc>
+          <w:tcPr>
+            <w:tcW w:w="3811" w:type="dxa"/>
+            <w:tcBorders/>
+            <w:vAlign w:val="center"/>
+          </w:tcPr>
+          <w:p>
+            <w:pPr>
+              <w:pStyle w:val="Zawartotabeli"/>
+              <w:rPr/>
+            </w:pPr>
+            <w:r>
+              <w:rPr/>
+              <w:t>Niski. Wystarczy opracować reguły.</w:t>
+            </w:r>
+          </w:p>
+        </w:tc>
+        <w:tc>
+          <w:tcPr>
+            <w:tcW w:w="3913" w:type="dxa"/>
+            <w:tcBorders/>
+            <w:vAlign w:val="center"/>
+          </w:tcPr>
+          <w:p>
+            <w:pPr>
+              <w:pStyle w:val="Zawartotabeli"/>
+              <w:rPr/>
+            </w:pPr>
+            <w:r>
+              <w:rPr/>
+              <w:t>Wysoki. Potrzebne są dane treningowe, trenowanie modelu i infrastruktura.</w:t>
+            </w:r>
+          </w:p>
+        </w:tc>
+      </w:tr>
+      <w:tr>
+        <w:trPr/>
+        <w:tc>
+          <w:tcPr>
+            <w:tcW w:w="1914" w:type="dxa"/>
+            <w:tcBorders/>
+            <w:vAlign w:val="center"/>
+          </w:tcPr>
+          <w:p>
+            <w:pPr>
+              <w:pStyle w:val="Zawartotabeli"/>
+              <w:rPr/>
+            </w:pPr>
+            <w:r>
+              <w:rPr>
+                <w:rStyle w:val="Mocnewyrnione"/>
+              </w:rPr>
+              <w:t>Dokładność</w:t>
+            </w:r>
+          </w:p>
+        </w:tc>
+        <w:tc>
+          <w:tcPr>
+            <w:tcW w:w="3811" w:type="dxa"/>
+            <w:tcBorders/>
+            <w:vAlign w:val="center"/>
+          </w:tcPr>
+          <w:p>
+            <w:pPr>
+              <w:pStyle w:val="Zawartotabeli"/>
+              <w:rPr/>
+            </w:pPr>
+            <w:r>
+              <w:rPr/>
+              <w:t>Niska do średniej. Dobrze działa dla prostych przypadków, ale często pomija obraźliwe treści lub generuje fałszywe alarmy.</w:t>
+            </w:r>
+          </w:p>
+        </w:tc>
+        <w:tc>
+          <w:tcPr>
+            <w:tcW w:w="3913" w:type="dxa"/>
+            <w:tcBorders/>
+            <w:vAlign w:val="center"/>
+          </w:tcPr>
+          <w:p>
+            <w:pPr>
+              <w:pStyle w:val="Zawartotabeli"/>
+              <w:rPr/>
+            </w:pPr>
+            <w:r>
+              <w:rPr/>
+              <w:t>Wysoka. Lepiej radzi sobie z różnorodnym językiem, ironią i kontekstem.</w:t>
+            </w:r>
+          </w:p>
+        </w:tc>
+      </w:tr>
+      <w:tr>
+        <w:trPr/>
+        <w:tc>
+          <w:tcPr>
+            <w:tcW w:w="1914" w:type="dxa"/>
+            <w:tcBorders/>
+            <w:vAlign w:val="center"/>
+          </w:tcPr>
+          <w:p>
+            <w:pPr>
+              <w:pStyle w:val="Zawartotabeli"/>
+              <w:rPr/>
+            </w:pPr>
+            <w:r>
+              <w:rPr>
+                <w:rStyle w:val="Mocnewyrnione"/>
+              </w:rPr>
+              <w:t>Łatwość utrzymania</w:t>
+            </w:r>
+          </w:p>
+        </w:tc>
+        <w:tc>
+          <w:tcPr>
+            <w:tcW w:w="3811" w:type="dxa"/>
+            <w:tcBorders/>
+            <w:vAlign w:val="center"/>
+          </w:tcPr>
+          <w:p>
+            <w:pPr>
+              <w:pStyle w:val="Zawartotabeli"/>
+              <w:rPr/>
+            </w:pPr>
+            <w:r>
+              <w:rPr/>
+              <w:t>Niska przy rozbudowanych systemach. Wymaga ciągłych aktualizacji reguł.</w:t>
+            </w:r>
+          </w:p>
+        </w:tc>
+        <w:tc>
+          <w:tcPr>
+            <w:tcW w:w="3913" w:type="dxa"/>
+            <w:tcBorders/>
+            <w:vAlign w:val="center"/>
+          </w:tcPr>
+          <w:p>
+            <w:pPr>
+              <w:pStyle w:val="Zawartotabeli"/>
+              <w:rPr/>
+            </w:pPr>
+            <w:r>
+              <w:rPr/>
+              <w:t>Średnia do wysok</w:t>
+            </w:r>
+            <w:r>
+              <w:rPr/>
+              <w:t>iej.</w:t>
+            </w:r>
+            <w:r>
+              <w:rPr/>
+              <w:t xml:space="preserve"> Wymaga okresowego douczania, ale mniej ręcznego definiowania przypadków.</w:t>
+            </w:r>
+          </w:p>
+        </w:tc>
+      </w:tr>
+      <w:tr>
+        <w:trPr/>
+        <w:tc>
+          <w:tcPr>
+            <w:tcW w:w="1914" w:type="dxa"/>
+            <w:tcBorders/>
+            <w:vAlign w:val="center"/>
+          </w:tcPr>
+          <w:p>
+            <w:pPr>
+              <w:pStyle w:val="Zawartotabeli"/>
+              <w:rPr/>
+            </w:pPr>
+            <w:r>
+              <w:rPr>
+                <w:rStyle w:val="Mocnewyrnione"/>
+              </w:rPr>
+              <w:t>Zużycie energii</w:t>
+            </w:r>
+          </w:p>
+        </w:tc>
+        <w:tc>
+          <w:tcPr>
+            <w:tcW w:w="3811" w:type="dxa"/>
+            <w:tcBorders/>
+            <w:vAlign w:val="center"/>
+          </w:tcPr>
+          <w:p>
+            <w:pPr>
+              <w:pStyle w:val="Zawartotabeli"/>
+              <w:rPr/>
+            </w:pPr>
+            <w:r>
+              <w:rPr/>
+              <w:t>Niskie zarówno podczas wdrożenia, jak i działania systemu.</w:t>
+            </w:r>
+          </w:p>
+        </w:tc>
+        <w:tc>
+          <w:tcPr>
+            <w:tcW w:w="3913" w:type="dxa"/>
+            <w:tcBorders/>
+            <w:vAlign w:val="center"/>
+          </w:tcPr>
+          <w:p>
+            <w:pPr>
+              <w:pStyle w:val="Zawartotabeli"/>
+              <w:rPr/>
+            </w:pPr>
+            <w:r>
+              <w:rPr/>
+              <w:t>Wysokie podczas trenowania modelu, średnie podczas późniejszego użytkowania.</w:t>
+            </w:r>
+          </w:p>
+        </w:tc>
+      </w:tr>
+    </w:tbl>
+    <w:p>
+      <w:pPr>
+        <w:pStyle w:val="Normal"/>
+        <w:widowControl/>
+        <w:bidi w:val="0"/>
+        <w:ind w:start="0" w:end="0" w:hanging="0"/>
+        <w:rPr/>
+      </w:pPr>
+      <w:r>
+        <w:rPr/>
+      </w:r>
+    </w:p>
+    <w:p>
+      <w:pPr>
+        <w:pStyle w:val="Normal"/>
+        <w:widowControl/>
+        <w:bidi w:val="0"/>
+        <w:ind w:start="0" w:end="0" w:hanging="0"/>
+        <w:rPr/>
+      </w:pPr>
+      <w:r>
+        <w:rPr/>
+        <w:t xml:space="preserve">Zaprojektuj rozwiązanie oparte na regułach: </w:t>
+      </w:r>
+      <w:r>
+        <w:rPr/>
+        <w:t>N/A</w:t>
+      </w:r>
+    </w:p>
+    <w:p>
+      <w:pPr>
+        <w:pStyle w:val="Normal"/>
+        <w:widowControl/>
+        <w:bidi w:val="0"/>
+        <w:ind w:start="0" w:end="0" w:hanging="0"/>
+        <w:rPr/>
+      </w:pPr>
+      <w:r>
+        <w:rPr/>
+      </w:r>
+    </w:p>
+    <w:p>
+      <w:pPr>
+        <w:pStyle w:val="Normal"/>
+        <w:widowControl/>
+        <w:bidi w:val="0"/>
+        <w:ind w:start="0" w:end="0" w:hanging="0"/>
+        <w:rPr/>
+      </w:pPr>
+      <w:r>
+        <w:rPr/>
+        <w:t xml:space="preserve">Zaprojektuj rozwiązanie oparte na ML: </w:t>
+      </w:r>
+      <w:r>
+        <w:rPr/>
+        <w:t>N/A</w:t>
+      </w:r>
+    </w:p>
+    <w:p>
+      <w:pPr>
+        <w:pStyle w:val="Normal"/>
+        <w:widowControl/>
+        <w:bidi w:val="0"/>
+        <w:ind w:start="0" w:end="0" w:hanging="0"/>
+        <w:rPr/>
+      </w:pPr>
+      <w:r>
+        <w:rPr/>
+      </w:r>
+    </w:p>
+    <w:p>
+      <w:pPr>
+        <w:pStyle w:val="Normal"/>
+        <w:widowControl/>
+        <w:bidi w:val="0"/>
+        <w:ind w:start="0" w:end="0" w:hanging="0"/>
+        <w:rPr/>
+      </w:pPr>
+      <w:r>
+        <w:rPr/>
+        <w:t xml:space="preserve">Która metoda jest lepsza i dlaczego?: </w:t>
+      </w:r>
+      <w:r>
+        <w:rPr/>
+        <w:t>W mojej ocenie ML jest lepszym rozwiązaniem, ponieważ w wykrywaniu inwektyw największe znaczenie ma dokładność, wykrywanie nowych wzorców, analiza kontekstu i skalowalność – porównanie zawarto w tabeli poniżej.</w:t>
+      </w:r>
+    </w:p>
+    <w:p>
+      <w:pPr>
+        <w:pStyle w:val="Normal"/>
+        <w:widowControl/>
+        <w:bidi w:val="0"/>
+        <w:ind w:start="0" w:end="0" w:hanging="0"/>
+        <w:rPr/>
+      </w:pPr>
+      <w:r>
+        <w:rPr/>
+      </w:r>
+    </w:p>
+    <w:p>
+      <w:pPr>
+        <w:pStyle w:val="Normal"/>
+        <w:widowControl/>
+        <w:bidi w:val="0"/>
+        <w:ind w:start="0" w:end="0" w:hanging="0"/>
+        <w:rPr/>
+      </w:pPr>
+      <w:r>
+        <w:rPr/>
+      </w:r>
+    </w:p>
+    <w:tbl>
+      <w:tblPr>
+        <w:tblW w:w="9638" w:type="dxa"/>
+        <w:jc w:val="start"/>
+        <w:tblInd w:w="0" w:type="dxa"/>
+        <w:tblLayout w:type="fixed"/>
+        <w:tblCellMar>
+          <w:top w:w="28" w:type="dxa"/>
+          <w:start w:w="28" w:type="dxa"/>
+          <w:bottom w:w="28" w:type="dxa"/>
+          <w:end w:w="28" w:type="dxa"/>
+        </w:tblCellMar>
+      </w:tblPr>
+      <w:tblGrid>
+        <w:gridCol w:w="2170"/>
+        <w:gridCol w:w="1518"/>
+        <w:gridCol w:w="5950"/>
+      </w:tblGrid>
+      <w:tr>
+        <w:trPr>
+          <w:tblHeader w:val="true"/>
+        </w:trPr>
+        <w:tc>
+          <w:tcPr>
+            <w:tcW w:w="2170" w:type="dxa"/>
+            <w:tcBorders/>
+            <w:vAlign w:val="center"/>
+          </w:tcPr>
+          <w:p>
+            <w:pPr>
+              <w:pStyle w:val="Nagwektabeli"/>
+              <w:rPr/>
+            </w:pPr>
+            <w:r>
+              <w:rPr/>
+              <w:t>Kryterium</w:t>
+            </w:r>
+          </w:p>
+        </w:tc>
+        <w:tc>
+          <w:tcPr>
+            <w:tcW w:w="1518" w:type="dxa"/>
+            <w:tcBorders/>
+            <w:vAlign w:val="center"/>
+          </w:tcPr>
+          <w:p>
+            <w:pPr>
+              <w:pStyle w:val="Nagwektabeli"/>
+              <w:rPr/>
+            </w:pPr>
+            <w:r>
+              <w:rPr/>
+              <w:t>Lepsza metoda</w:t>
+            </w:r>
+          </w:p>
+        </w:tc>
+        <w:tc>
+          <w:tcPr>
+            <w:tcW w:w="5950" w:type="dxa"/>
+            <w:tcBorders/>
+            <w:vAlign w:val="center"/>
+          </w:tcPr>
+          <w:p>
+            <w:pPr>
+              <w:pStyle w:val="Nagwektabeli"/>
+              <w:rPr/>
+            </w:pPr>
+            <w:r>
+              <w:rPr/>
+              <w:t>Dlaczego?</w:t>
+            </w:r>
+          </w:p>
+        </w:tc>
+      </w:tr>
+      <w:tr>
+        <w:trPr/>
+        <w:tc>
+          <w:tcPr>
+            <w:tcW w:w="2170" w:type="dxa"/>
+            <w:tcBorders/>
+            <w:vAlign w:val="center"/>
+          </w:tcPr>
+          <w:p>
+            <w:pPr>
+              <w:pStyle w:val="Zawartotabeli"/>
+              <w:rPr/>
+            </w:pPr>
+            <w:r>
+              <w:rPr/>
+              <w:t>Dokładność</w:t>
+            </w:r>
+          </w:p>
+        </w:tc>
+        <w:tc>
+          <w:tcPr>
+            <w:tcW w:w="1518" w:type="dxa"/>
+            <w:tcBorders/>
+            <w:vAlign w:val="center"/>
+          </w:tcPr>
+          <w:p>
+            <w:pPr>
+              <w:pStyle w:val="Zawartotabeli"/>
+              <w:rPr/>
+            </w:pPr>
+            <w:r>
+              <w:rPr>
+                <w:rStyle w:val="Mocnewyrnione"/>
+              </w:rPr>
+              <w:t>Machine Learning</w:t>
+            </w:r>
+          </w:p>
+        </w:tc>
+        <w:tc>
+          <w:tcPr>
+            <w:tcW w:w="5950" w:type="dxa"/>
+            <w:tcBorders/>
+            <w:vAlign w:val="center"/>
+          </w:tcPr>
+          <w:p>
+            <w:pPr>
+              <w:pStyle w:val="Zawartotabeli"/>
+              <w:rPr/>
+            </w:pPr>
+            <w:r>
+              <w:rPr/>
+              <w:t>Potrafi rozpoznawać obraźliwe treści nawet wtedy, gdy nie zawierają znanych wulgaryzmów.</w:t>
+            </w:r>
+          </w:p>
+        </w:tc>
+      </w:tr>
+      <w:tr>
+        <w:trPr/>
+        <w:tc>
+          <w:tcPr>
+            <w:tcW w:w="2170" w:type="dxa"/>
+            <w:tcBorders/>
+            <w:vAlign w:val="center"/>
+          </w:tcPr>
+          <w:p>
+            <w:pPr>
+              <w:pStyle w:val="Zawartotabeli"/>
+              <w:rPr/>
+            </w:pPr>
+            <w:r>
+              <w:rPr/>
+              <w:t>Wykrywanie nowych obelg</w:t>
+            </w:r>
+          </w:p>
+        </w:tc>
+        <w:tc>
+          <w:tcPr>
+            <w:tcW w:w="1518" w:type="dxa"/>
+            <w:tcBorders/>
+            <w:vAlign w:val="center"/>
+          </w:tcPr>
+          <w:p>
+            <w:pPr>
+              <w:pStyle w:val="Zawartotabeli"/>
+              <w:rPr/>
+            </w:pPr>
+            <w:r>
+              <w:rPr>
+                <w:rStyle w:val="Mocnewyrnione"/>
+              </w:rPr>
+              <w:t>Machine Learning</w:t>
+            </w:r>
+          </w:p>
+        </w:tc>
+        <w:tc>
+          <w:tcPr>
+            <w:tcW w:w="5950" w:type="dxa"/>
+            <w:tcBorders/>
+            <w:vAlign w:val="center"/>
+          </w:tcPr>
+          <w:p>
+            <w:pPr>
+              <w:pStyle w:val="Zawartotabeli"/>
+              <w:rPr/>
+            </w:pPr>
+            <w:r>
+              <w:rPr/>
+              <w:t>Uczy się wzorców językowych i może identyfikować nowe formy obrażania.</w:t>
+            </w:r>
+          </w:p>
+        </w:tc>
+      </w:tr>
+      <w:tr>
+        <w:trPr/>
+        <w:tc>
+          <w:tcPr>
+            <w:tcW w:w="2170" w:type="dxa"/>
+            <w:tcBorders/>
+            <w:vAlign w:val="center"/>
+          </w:tcPr>
+          <w:p>
+            <w:pPr>
+              <w:pStyle w:val="Zawartotabeli"/>
+              <w:rPr/>
+            </w:pPr>
+            <w:r>
+              <w:rPr/>
+              <w:t>Analiza kontekstu</w:t>
+            </w:r>
+          </w:p>
+        </w:tc>
+        <w:tc>
+          <w:tcPr>
+            <w:tcW w:w="1518" w:type="dxa"/>
+            <w:tcBorders/>
+            <w:vAlign w:val="center"/>
+          </w:tcPr>
+          <w:p>
+            <w:pPr>
+              <w:pStyle w:val="Zawartotabeli"/>
+              <w:rPr/>
+            </w:pPr>
+            <w:r>
+              <w:rPr>
+                <w:rStyle w:val="Mocnewyrnione"/>
+              </w:rPr>
+              <w:t>Machine Learning</w:t>
+            </w:r>
+          </w:p>
+        </w:tc>
+        <w:tc>
+          <w:tcPr>
+            <w:tcW w:w="5950" w:type="dxa"/>
+            <w:tcBorders/>
+            <w:vAlign w:val="center"/>
+          </w:tcPr>
+          <w:p>
+            <w:pPr>
+              <w:pStyle w:val="Zawartotabeli"/>
+              <w:rPr/>
+            </w:pPr>
+            <w:r>
+              <w:rPr/>
+              <w:t>Rozumie znaczenie całego zdania, a nie tylko pojedyncze słowa.</w:t>
+            </w:r>
+          </w:p>
+        </w:tc>
+      </w:tr>
+      <w:tr>
+        <w:trPr/>
+        <w:tc>
+          <w:tcPr>
+            <w:tcW w:w="2170" w:type="dxa"/>
+            <w:tcBorders/>
+            <w:vAlign w:val="center"/>
+          </w:tcPr>
+          <w:p>
+            <w:pPr>
+              <w:pStyle w:val="Zawartotabeli"/>
+              <w:rPr/>
+            </w:pPr>
+            <w:r>
+              <w:rPr/>
+              <w:t>Skalowalność</w:t>
+            </w:r>
+          </w:p>
+        </w:tc>
+        <w:tc>
+          <w:tcPr>
+            <w:tcW w:w="1518" w:type="dxa"/>
+            <w:tcBorders/>
+            <w:vAlign w:val="center"/>
+          </w:tcPr>
+          <w:p>
+            <w:pPr>
+              <w:pStyle w:val="Zawartotabeli"/>
+              <w:rPr/>
+            </w:pPr>
+            <w:r>
+              <w:rPr>
+                <w:rStyle w:val="Mocnewyrnione"/>
+              </w:rPr>
+              <w:t>Machine Learning</w:t>
+            </w:r>
+          </w:p>
+        </w:tc>
+        <w:tc>
+          <w:tcPr>
+            <w:tcW w:w="5950" w:type="dxa"/>
+            <w:tcBorders/>
+            <w:vAlign w:val="center"/>
+          </w:tcPr>
+          <w:p>
+            <w:pPr>
+              <w:pStyle w:val="Zawartotabeli"/>
+              <w:rPr/>
+            </w:pPr>
+            <w:r>
+              <w:rPr/>
+              <w:t>Dobrze działa przy milionach komentarzy i różnorodnym języku użytkowników.</w:t>
+            </w:r>
+          </w:p>
+        </w:tc>
+      </w:tr>
+      <w:tr>
+        <w:trPr/>
+        <w:tc>
+          <w:tcPr>
+            <w:tcW w:w="2170" w:type="dxa"/>
+            <w:tcBorders/>
+            <w:vAlign w:val="center"/>
+          </w:tcPr>
+          <w:p>
+            <w:pPr>
+              <w:pStyle w:val="Zawartotabeli"/>
+              <w:rPr/>
+            </w:pPr>
+            <w:r>
+              <w:rPr/>
+              <w:t>Koszt początkowy</w:t>
+            </w:r>
+          </w:p>
+        </w:tc>
+        <w:tc>
+          <w:tcPr>
+            <w:tcW w:w="1518" w:type="dxa"/>
+            <w:tcBorders/>
+            <w:vAlign w:val="center"/>
+          </w:tcPr>
+          <w:p>
+            <w:pPr>
+              <w:pStyle w:val="Zawartotabeli"/>
+              <w:rPr/>
+            </w:pPr>
+            <w:r>
+              <w:rPr>
+                <w:rStyle w:val="Mocnewyrnione"/>
+              </w:rPr>
+              <w:t>Reguły</w:t>
+            </w:r>
+          </w:p>
+        </w:tc>
+        <w:tc>
+          <w:tcPr>
+            <w:tcW w:w="5950" w:type="dxa"/>
+            <w:tcBorders/>
+            <w:vAlign w:val="center"/>
+          </w:tcPr>
+          <w:p>
+            <w:pPr>
+              <w:pStyle w:val="Zawartotabeli"/>
+              <w:rPr/>
+            </w:pPr>
+            <w:r>
+              <w:rPr/>
+              <w:t>Nie wymaga danych treningowych ani trenowania modelu.</w:t>
+            </w:r>
+          </w:p>
+        </w:tc>
+      </w:tr>
+      <w:tr>
+        <w:trPr/>
+        <w:tc>
+          <w:tcPr>
+            <w:tcW w:w="2170" w:type="dxa"/>
+            <w:tcBorders/>
+            <w:vAlign w:val="center"/>
+          </w:tcPr>
+          <w:p>
+            <w:pPr>
+              <w:pStyle w:val="Zawartotabeli"/>
+              <w:rPr/>
+            </w:pPr>
+            <w:r>
+              <w:rPr/>
+              <w:t>Zużycie energii</w:t>
+            </w:r>
+          </w:p>
+        </w:tc>
+        <w:tc>
+          <w:tcPr>
+            <w:tcW w:w="1518" w:type="dxa"/>
+            <w:tcBorders/>
+            <w:vAlign w:val="center"/>
+          </w:tcPr>
+          <w:p>
+            <w:pPr>
+              <w:pStyle w:val="Zawartotabeli"/>
+              <w:rPr/>
+            </w:pPr>
+            <w:r>
+              <w:rPr>
+                <w:rStyle w:val="Mocnewyrnione"/>
+              </w:rPr>
+              <w:t>Reguły</w:t>
+            </w:r>
+          </w:p>
+        </w:tc>
+        <w:tc>
+          <w:tcPr>
+            <w:tcW w:w="5950" w:type="dxa"/>
+            <w:tcBorders/>
+            <w:vAlign w:val="center"/>
+          </w:tcPr>
+          <w:p>
+            <w:pPr>
+              <w:pStyle w:val="Zawartotabeli"/>
+              <w:rPr/>
+            </w:pPr>
+            <w:r>
+              <w:rPr/>
+              <w:t>Wykonuje jedynie proste sprawdzenia tekstu.</w:t>
+            </w:r>
+          </w:p>
+        </w:tc>
+      </w:tr>
+      <w:tr>
+        <w:trPr/>
+        <w:tc>
+          <w:tcPr>
+            <w:tcW w:w="2170" w:type="dxa"/>
+            <w:tcBorders/>
+            <w:vAlign w:val="center"/>
+          </w:tcPr>
+          <w:p>
+            <w:pPr>
+              <w:pStyle w:val="Zawartotabeli"/>
+              <w:rPr/>
+            </w:pPr>
+            <w:r>
+              <w:rPr/>
+              <w:t>Przejrzystość decyzji</w:t>
+            </w:r>
+          </w:p>
+        </w:tc>
+        <w:tc>
+          <w:tcPr>
+            <w:tcW w:w="1518" w:type="dxa"/>
+            <w:tcBorders/>
+            <w:vAlign w:val="center"/>
+          </w:tcPr>
+          <w:p>
+            <w:pPr>
+              <w:pStyle w:val="Zawartotabeli"/>
+              <w:rPr/>
+            </w:pPr>
+            <w:r>
+              <w:rPr>
+                <w:rStyle w:val="Mocnewyrnione"/>
+              </w:rPr>
+              <w:t>Reguły</w:t>
+            </w:r>
+          </w:p>
+        </w:tc>
+        <w:tc>
+          <w:tcPr>
+            <w:tcW w:w="5950" w:type="dxa"/>
+            <w:tcBorders/>
+            <w:vAlign w:val="center"/>
+          </w:tcPr>
+          <w:p>
+            <w:pPr>
+              <w:pStyle w:val="Zawartotabeli"/>
+              <w:rPr/>
+            </w:pPr>
+            <w:r>
+              <w:rPr/>
+              <w:t>Łatwo wskazać, która reguła spowodowała blokadę komentarza.</w:t>
+            </w:r>
+          </w:p>
+        </w:tc>
+      </w:tr>
+      <w:tr>
+        <w:trPr/>
+        <w:tc>
+          <w:tcPr>
+            <w:tcW w:w="2170" w:type="dxa"/>
+            <w:tcBorders/>
+            <w:vAlign w:val="center"/>
+          </w:tcPr>
+          <w:p>
+            <w:pPr>
+              <w:pStyle w:val="Zawartotabeli"/>
+              <w:rPr/>
+            </w:pPr>
+            <w:r>
+              <w:rPr/>
+              <w:t>Łatwość wdrożenia</w:t>
+            </w:r>
+          </w:p>
+        </w:tc>
+        <w:tc>
+          <w:tcPr>
+            <w:tcW w:w="1518" w:type="dxa"/>
+            <w:tcBorders/>
+            <w:vAlign w:val="center"/>
+          </w:tcPr>
+          <w:p>
+            <w:pPr>
+              <w:pStyle w:val="Zawartotabeli"/>
+              <w:rPr/>
+            </w:pPr>
+            <w:r>
+              <w:rPr>
+                <w:rStyle w:val="Mocnewyrnione"/>
+              </w:rPr>
+              <w:t>Reguły</w:t>
+            </w:r>
+          </w:p>
+        </w:tc>
+        <w:tc>
+          <w:tcPr>
+            <w:tcW w:w="5950" w:type="dxa"/>
+            <w:tcBorders/>
+            <w:vAlign w:val="center"/>
+          </w:tcPr>
+          <w:p>
+            <w:pPr>
+              <w:pStyle w:val="Zawartotabeli"/>
+              <w:rPr/>
+            </w:pPr>
+            <w:r>
+              <w:rPr/>
+              <w:t>Można je zaimplementować szybko i bez specjalistycznej wiedzy z zakresu AI.</w:t>
+            </w:r>
+          </w:p>
+        </w:tc>
+      </w:tr>
+    </w:tbl>
+    <w:p>
+      <w:pPr>
+        <w:pStyle w:val="Normal"/>
+        <w:widowControl/>
+        <w:bidi w:val="0"/>
+        <w:ind w:start="0" w:end="0" w:hanging="0"/>
+        <w:rPr/>
+      </w:pPr>
+      <w:r>
+        <w:rPr/>
+      </w:r>
+    </w:p>
+    <w:p>
+      <w:pPr>
+        <w:pStyle w:val="Normal"/>
+        <w:widowControl/>
+        <w:bidi w:val="0"/>
+        <w:ind w:start="0" w:end="0" w:hanging="0"/>
+        <w:rPr/>
+      </w:pPr>
+      <w:r>
+        <w:rPr/>
+        <w:t xml:space="preserve">Czy można połączyć oba podejścia? Jak?: </w:t>
+      </w:r>
+      <w:r>
+        <w:rPr>
+          <w:rFonts w:ascii="Segoe UI" w:hAnsi="Segoe UI"/>
+          <w:b w:val="false"/>
+          <w:i w:val="false"/>
+          <w:caps w:val="false"/>
+          <w:smallCaps w:val="false"/>
+          <w:sz w:val="21"/>
+        </w:rPr>
+        <w:t xml:space="preserve">W rzeczywistych systemach moderacji najczęściej stosuje się podejście hybrydowe, które łączy zalety reguł i Machine Learning. Najpierw </w:t>
+      </w:r>
+      <w:r>
+        <w:rPr>
+          <w:rFonts w:ascii="Segoe UI" w:hAnsi="Segoe UI"/>
+          <w:b w:val="false"/>
+          <w:i w:val="false"/>
+          <w:caps w:val="false"/>
+          <w:smallCaps w:val="false"/>
+          <w:sz w:val="21"/>
+        </w:rPr>
+        <w:t xml:space="preserve">tekst poddawany jest analizie przez </w:t>
+      </w:r>
+      <w:r>
+        <w:rPr>
+          <w:rFonts w:ascii="Segoe UI" w:hAnsi="Segoe UI"/>
+          <w:b w:val="false"/>
+          <w:i w:val="false"/>
+          <w:caps w:val="false"/>
+          <w:smallCaps w:val="false"/>
+          <w:sz w:val="21"/>
+        </w:rPr>
+        <w:t xml:space="preserve">proste reguły, a </w:t>
+      </w:r>
+      <w:r>
+        <w:rPr>
+          <w:rFonts w:ascii="Segoe UI" w:hAnsi="Segoe UI"/>
+          <w:b w:val="false"/>
+          <w:i w:val="false"/>
+          <w:caps w:val="false"/>
+          <w:smallCaps w:val="false"/>
+          <w:sz w:val="21"/>
+        </w:rPr>
+        <w:t xml:space="preserve">w przypadku braku </w:t>
+      </w:r>
+      <w:r>
+        <w:rPr>
+          <w:rFonts w:eastAsia="NSimSun" w:cs="Lucida Sans" w:ascii="Segoe UI" w:hAnsi="Segoe UI"/>
+          <w:b w:val="false"/>
+          <w:i w:val="false"/>
+          <w:caps w:val="false"/>
+          <w:smallCaps w:val="false"/>
+          <w:color w:val="auto"/>
+          <w:kern w:val="2"/>
+          <w:sz w:val="21"/>
+          <w:szCs w:val="24"/>
+          <w:lang w:val="pl-PL" w:eastAsia="zh-CN" w:bidi="hi-IN"/>
+        </w:rPr>
+        <w:t xml:space="preserve">wykrycia oczywistego wulgaryzmu, </w:t>
+      </w:r>
+      <w:r>
+        <w:rPr>
+          <w:rFonts w:ascii="Segoe UI" w:hAnsi="Segoe UI"/>
+          <w:b w:val="false"/>
+          <w:i w:val="false"/>
+          <w:caps w:val="false"/>
+          <w:smallCaps w:val="false"/>
+          <w:sz w:val="21"/>
+        </w:rPr>
+        <w:t>model ML analizuje trudniejsze przypadki. Korzyś</w:t>
+      </w:r>
+      <w:r>
+        <w:rPr>
+          <w:rFonts w:eastAsia="NSimSun" w:cs="Lucida Sans" w:ascii="Segoe UI" w:hAnsi="Segoe UI"/>
+          <w:b w:val="false"/>
+          <w:i w:val="false"/>
+          <w:caps w:val="false"/>
+          <w:smallCaps w:val="false"/>
+          <w:color w:val="auto"/>
+          <w:kern w:val="2"/>
+          <w:sz w:val="21"/>
+          <w:szCs w:val="24"/>
+          <w:lang w:val="pl-PL" w:eastAsia="zh-CN" w:bidi="hi-IN"/>
+        </w:rPr>
+        <w:t>ciami w tym przypadku są</w:t>
+      </w:r>
+      <w:r>
+        <w:rPr>
+          <w:rFonts w:ascii="Segoe UI" w:hAnsi="Segoe UI"/>
+          <w:b w:val="false"/>
+          <w:i w:val="false"/>
+          <w:caps w:val="false"/>
+          <w:smallCaps w:val="false"/>
+          <w:sz w:val="21"/>
+        </w:rPr>
+        <w:t xml:space="preserve"> mniejsze koszty obliczeniowe i szybsze działanie. </w:t>
+      </w:r>
+      <w:r>
+        <w:rPr>
+          <w:rFonts w:ascii="Segoe UI" w:hAnsi="Segoe UI"/>
+          <w:b w:val="false"/>
+          <w:i w:val="false"/>
+          <w:caps w:val="false"/>
+          <w:smallCaps w:val="false"/>
+          <w:sz w:val="21"/>
+        </w:rPr>
+        <w:t>Czasami w celu dokładniejszej weryfikacji dodawany jest trzeci stopień weryfikacji – manualne sprawdzanie komentarzy przez moderatora.</w:t>
       </w:r>
     </w:p>
     <w:sectPr>

</xml_diff>